<commit_message>
docs+feat: Kuma AI knowledge-PDF refresh planned (spec v1.12, roadmap); gap report v1.4
- Spec v1.12: Kuma AI Chat → Planned changes — rewrite the n8n company-knowledge
  PDF from the current spec and re-load it (later).
- /admin/roadmap: new "Kuma AI · Knowledge" item. ROADMAP_ADDITIONS merge new
  seed items once into browsers that already saved a roadmap (seededIds), so a
  deleted item stays deleted.
- Gap report v1.4: priority 1 now "rules fix to production" (dev done).

Co-Authored-By: Claude Opus 5.5 <noreply@anthropic.com>
Claude-Session: https://claude.ai/code/session_01W5YwC4gzC7em6pW8dCKFbL
</commit_message>
<xml_diff>
--- a/docs/Rachelle Product Specs/Kumami_Gap_Report.docx
+++ b/docs/Rachelle Product Specs/Kumami_Gap_Report.docx
@@ -25,10 +25,10 @@
         <w:rPr>
           <w:b/>
         </w:rPr>
-        <w:t xml:space="preserve">Report v1.3</w:t>
+        <w:t xml:space="preserve">Report v1.4</w:t>
       </w:r>
       <w:r>
-        <w:t xml:space="preserve"> · 10 Oct 2026 · compares Rachelle's “Kumami Website (6).docx” against the dev branch at commit dev (admin-content QA + Following/Digest fixes) (as-built spec v1.9).</w:t>
+        <w:t xml:space="preserve"> · 11 Oct 2026 · compares Rachelle's “Kumami Website (6).docx” against the dev branch at commit dev (rules on kumami-dev, coin logos, roadmap) (as-built spec v1.12).</w:t>
       </w:r>
     </w:p>
     <w:p>
@@ -1554,7 +1554,7 @@
         <w:rPr>
           <w:b/>
         </w:rPr>
-        <w:t xml:space="preserve">1. Deploy the Firestore rules fix (security) </w:t>
+        <w:t xml:space="preserve">1. Deploy the Firestore rules fix to production (security) </w:t>
       </w:r>
       <w:r>
         <w:rPr>
@@ -1566,7 +1566,7 @@
     <w:p>
       <w:pPr/>
       <w:r>
-        <w:t xml:space="preserve">Right now any signed-in user can make themselves Pro or even superadmin from the browser console, and read Pro content without paying. The fix is written and tested on dev; it needs your go to deploy (it likely affects production too).</w:t>
+        <w:t xml:space="preserve">Done and tested on the dev database (kumami-dev) on 10 Oct. Production — which kumami.world and the deployed dev website use — still lets a signed-in user make themselves Pro or superadmin and read Pro content without paying, until Andrew deploys the rules there.</w:t>
       </w:r>
     </w:p>
     <w:p>
@@ -7868,6 +7868,30 @@
       </w:pPr>
       <w:r>
         <w:t xml:space="preserve">No status changes; refreshed against Andrew’s spec v1.9.</w:t>
+      </w:r>
+    </w:p>
+    <w:p>
+      <w:pPr>
+        <w:pStyle w:val="Heading2"/>
+      </w:pPr>
+      <w:r>
+        <w:t xml:space="preserve">v1.4 — 11 Oct 2026</w:t>
+      </w:r>
+    </w:p>
+    <w:p>
+      <w:pPr>
+        <w:pStyle w:val="ListBullet"/>
+      </w:pPr>
+      <w:r>
+        <w:t xml:space="preserve">Priority 1 updated: the Firestore rules fix is live on kumami-dev; production deploy still pending.</w:t>
+      </w:r>
+    </w:p>
+    <w:p>
+      <w:pPr>
+        <w:pStyle w:val="ListBullet"/>
+      </w:pPr>
+      <w:r>
+        <w:t xml:space="preserve">Refreshed against Andrew’s spec v1.12 (coin logos; Kuma AI knowledge refresh planned).</w:t>
       </w:r>
     </w:p>
   </w:body>

</xml_diff>

<commit_message>
docs(spec): v1.15 — legal, privacy & cookies (Basic §7); gap report v1.5; QA report
Co-Authored-By: Claude Opus 5.5 <noreply@anthropic.com>
</commit_message>
<xml_diff>
--- a/docs/Rachelle Product Specs/Kumami_Gap_Report.docx
+++ b/docs/Rachelle Product Specs/Kumami_Gap_Report.docx
@@ -25,10 +25,10 @@
         <w:rPr>
           <w:b/>
         </w:rPr>
-        <w:t xml:space="preserve">Report v1.4</w:t>
+        <w:t xml:space="preserve">Report v1.5</w:t>
       </w:r>
       <w:r>
-        <w:t xml:space="preserve"> · 11 Oct 2026 · compares Rachelle's “Kumami Website (6).docx” against the dev branch at commit dev (rules on kumami-dev, coin logos, roadmap) (as-built spec v1.12).</w:t>
+        <w:t xml:space="preserve"> · 14 Oct 2026 · compares Rachelle's “Kumami Website (6).docx” against the dev branch at commit dev (legal / compliance pass) (as-built spec v1.15).</w:t>
       </w:r>
     </w:p>
     <w:p>
@@ -2198,6 +2198,52 @@
           </w:p>
         </w:tc>
       </w:tr>
+      <w:tr>
+        <w:tc>
+          <w:tcPr>
+            <w:tcW w:type="dxa" w:w="1700"/>
+          </w:tcPr>
+          <w:p>
+            <w:pPr/>
+            <w:r>
+              <w:t xml:space="preserve">Legal pages and consent (not in Rachelle's spec)</w:t>
+            </w:r>
+          </w:p>
+        </w:tc>
+        <w:tc>
+          <w:tcPr>
+            <w:tcW w:type="dxa" w:w="2500"/>
+          </w:tcPr>
+          <w:p>
+            <w:pPr/>
+            <w:r>
+              <w:t xml:space="preserve">Not covered by her spec.</w:t>
+            </w:r>
+          </w:p>
+        </w:tc>
+        <w:tc>
+          <w:tcPr>
+            <w:tcW w:type="dxa" w:w="2500"/>
+          </w:tcPr>
+          <w:p>
+            <w:pPr/>
+            <w:r>
+              <w:t xml:space="preserve">Privacy Policy, cookie banner (analytics only after Accept), Terms/Privacy links at sign-up and payment, and a not-financial-advice footer on every app page (Andrew's spec v1.15, Basic §7).</w:t>
+            </w:r>
+          </w:p>
+        </w:tc>
+        <w:tc>
+          <w:tcPr>
+            <w:tcW w:type="dxa" w:w="2300"/>
+          </w:tcPr>
+          <w:p>
+            <w:pPr/>
+            <w:r>
+              <w:t xml:space="preserve">Company legal name, country and privacy email for the policy; confirm 18+; refund policy; referral rules.</w:t>
+            </w:r>
+          </w:p>
+        </w:tc>
+      </w:tr>
     </w:tbl>
     <w:p>
       <w:r>
@@ -7892,6 +7938,22 @@
       </w:pPr>
       <w:r>
         <w:t xml:space="preserve">Refreshed against Andrew’s spec v1.12 (coin logos; Kuma AI knowledge refresh planned).</w:t>
+      </w:r>
+    </w:p>
+    <w:p>
+      <w:pPr>
+        <w:pStyle w:val="Heading2"/>
+      </w:pPr>
+      <w:r>
+        <w:t xml:space="preserve">v1.5 — 14 Oct 2026</w:t>
+      </w:r>
+    </w:p>
+    <w:p>
+      <w:pPr>
+        <w:pStyle w:val="ListBullet"/>
+      </w:pPr>
+      <w:r>
+        <w:t xml:space="preserve">Refreshed against Andrew’s spec v1.15 (legal / compliance pass). No rows from Rachelle’s spec changed — her spec doesn’t cover legal pages; added a decisions row for the open legal questions.</w:t>
       </w:r>
     </w:p>
   </w:body>

</xml_diff>

<commit_message>
docs(spec): v1.16 — account deletion (Basic §8); gap report v1.6; QA report
Co-Authored-By: Claude Opus 5.5 <noreply@anthropic.com>
</commit_message>
<xml_diff>
--- a/docs/Rachelle Product Specs/Kumami_Gap_Report.docx
+++ b/docs/Rachelle Product Specs/Kumami_Gap_Report.docx
@@ -25,10 +25,10 @@
         <w:rPr>
           <w:b/>
         </w:rPr>
-        <w:t xml:space="preserve">Report v1.5</w:t>
+        <w:t xml:space="preserve">Report v1.6</w:t>
       </w:r>
       <w:r>
-        <w:t xml:space="preserve"> · 14 Oct 2026 · compares Rachelle's “Kumami Website (6).docx” against the dev branch at commit dev (legal / compliance pass) (as-built spec v1.15).</w:t>
+        <w:t xml:space="preserve"> · 14 Oct 2026 · compares Rachelle's “Kumami Website (6).docx” against the dev branch at commit dev (account deletion) (as-built spec v1.16).</w:t>
       </w:r>
     </w:p>
     <w:p>
@@ -2228,7 +2228,7 @@
           <w:p>
             <w:pPr/>
             <w:r>
-              <w:t xml:space="preserve">Privacy Policy, cookie banner (analytics only after Accept), Terms/Privacy links at sign-up and payment, and a not-financial-advice footer on every app page (Andrew's spec v1.15, Basic §7).</w:t>
+              <w:t xml:space="preserve">Privacy Policy, cookie banner (analytics only after Accept), Terms/Privacy links at sign-up and payment, a not-financial-advice footer on every app page (Andrew's spec v1.15, Basic §7), and self-serve account deletion in Profile (v1.16, Basic §8).</w:t>
             </w:r>
           </w:p>
         </w:tc>
@@ -7954,6 +7954,22 @@
       </w:pPr>
       <w:r>
         <w:t xml:space="preserve">Refreshed against Andrew’s spec v1.15 (legal / compliance pass). No rows from Rachelle’s spec changed — her spec doesn’t cover legal pages; added a decisions row for the open legal questions.</w:t>
+      </w:r>
+    </w:p>
+    <w:p>
+      <w:pPr>
+        <w:pStyle w:val="Heading2"/>
+      </w:pPr>
+      <w:r>
+        <w:t xml:space="preserve">v1.6 — 14 Oct 2026</w:t>
+      </w:r>
+    </w:p>
+    <w:p>
+      <w:pPr>
+        <w:pStyle w:val="ListBullet"/>
+      </w:pPr>
+      <w:r>
+        <w:t xml:space="preserve">Refreshed against Andrew’s spec v1.16 (self-serve account deletion, Basic §8). No rows from Rachelle’s spec changed — her spec doesn’t cover account deletion; the legal decisions row now mentions it.</w:t>
       </w:r>
     </w:p>
   </w:body>

</xml_diff>

<commit_message>
docs(spec): v1.17 — Terms of Service rewrite (Basic §7); gap report v1.7
Co-Authored-By: Claude Opus 5.5 <noreply@anthropic.com>
</commit_message>
<xml_diff>
--- a/docs/Rachelle Product Specs/Kumami_Gap_Report.docx
+++ b/docs/Rachelle Product Specs/Kumami_Gap_Report.docx
@@ -25,10 +25,10 @@
         <w:rPr>
           <w:b/>
         </w:rPr>
-        <w:t xml:space="preserve">Report v1.6</w:t>
+        <w:t xml:space="preserve">Report v1.7</w:t>
       </w:r>
       <w:r>
-        <w:t xml:space="preserve"> · 14 Oct 2026 · compares Rachelle's “Kumami Website (6).docx” against the dev branch at commit dev (account deletion) (as-built spec v1.16).</w:t>
+        <w:t xml:space="preserve"> · 14 Oct 2026 · compares Rachelle's “Kumami Website (6).docx” against the dev branch at commit dev (Terms update) (as-built spec v1.17).</w:t>
       </w:r>
     </w:p>
     <w:p>
@@ -2228,7 +2228,7 @@
           <w:p>
             <w:pPr/>
             <w:r>
-              <w:t xml:space="preserve">Privacy Policy, cookie banner (analytics only after Accept), Terms/Privacy links at sign-up and payment, a not-financial-advice footer on every app page (Andrew's spec v1.15, Basic §7), and self-serve account deletion in Profile (v1.16, Basic §8).</w:t>
+              <w:t xml:space="preserve">Privacy Policy, cookie banner (analytics only after Accept), Terms/Privacy links at sign-up and payment, a not-financial-advice footer on every app page (Andrew's spec v1.15, Basic §7), self-serve account deletion in Profile (v1.16, Basic §8), and rewritten Terms of Service with 18+, refunds (none once a period has started), referral rules, sanctions, AI output and copyright contact (v1.17).</w:t>
             </w:r>
           </w:p>
         </w:tc>
@@ -2239,7 +2239,7 @@
           <w:p>
             <w:pPr/>
             <w:r>
-              <w:t xml:space="preserve">Company legal name, country and privacy email for the policy; confirm 18+; refund policy; referral rules.</w:t>
+              <w:t xml:space="preserve">Company legal name, country and contact email (still placeholders on Terms and Privacy); a lawyer review before main.</w:t>
             </w:r>
           </w:p>
         </w:tc>
@@ -7970,6 +7970,22 @@
       </w:pPr>
       <w:r>
         <w:t xml:space="preserve">Refreshed against Andrew’s spec v1.16 (self-serve account deletion, Basic §8). No rows from Rachelle’s spec changed — her spec doesn’t cover account deletion; the legal decisions row now mentions it.</w:t>
+      </w:r>
+    </w:p>
+    <w:p>
+      <w:pPr>
+        <w:pStyle w:val="Heading2"/>
+      </w:pPr>
+      <w:r>
+        <w:t xml:space="preserve">v1.7 — 14 Oct 2026</w:t>
+      </w:r>
+    </w:p>
+    <w:p>
+      <w:pPr>
+        <w:pStyle w:val="ListBullet"/>
+      </w:pPr>
+      <w:r>
+        <w:t xml:space="preserve">Refreshed against Andrew’s spec v1.17 (Terms of Service rewrite). No rows from Rachelle’s spec changed — her spec doesn’t cover legal pages; the legal decisions row now only asks for company details and a lawyer review.</w:t>
       </w:r>
     </w:p>
   </w:body>

</xml_diff>

<commit_message>
docs(qa): legal undo QA report; gap report v1.8
Co-Authored-By: Claude Opus 5.5 <noreply@anthropic.com>
</commit_message>
<xml_diff>
--- a/docs/Rachelle Product Specs/Kumami_Gap_Report.docx
+++ b/docs/Rachelle Product Specs/Kumami_Gap_Report.docx
@@ -25,10 +25,10 @@
         <w:rPr>
           <w:b/>
         </w:rPr>
-        <w:t xml:space="preserve">Report v1.7</w:t>
+        <w:t xml:space="preserve">Report v1.8</w:t>
       </w:r>
       <w:r>
-        <w:t xml:space="preserve"> · 14 Oct 2026 · compares Rachelle's “Kumami Website (6).docx” against the dev branch at commit dev (Terms update) (as-built spec v1.17).</w:t>
+        <w:t xml:space="preserve"> · 15 Oct 2026 · compares Rachelle's “Kumami Website (6).docx” against the dev branch at commit dev (legal undo) (as-built spec v1.18).</w:t>
       </w:r>
     </w:p>
     <w:p>
@@ -2228,7 +2228,7 @@
           <w:p>
             <w:pPr/>
             <w:r>
-              <w:t xml:space="preserve">Privacy Policy, cookie banner (analytics only after Accept), Terms/Privacy links at sign-up and payment, a not-financial-advice footer on every app page (Andrew's spec v1.15, Basic §7), self-serve account deletion in Profile (v1.16, Basic §8), and rewritten Terms of Service with 18+, refunds (none once a period has started), referral rules, sanctions, AI output and copyright contact (v1.17).</w:t>
+              <w:t xml:space="preserve">The team's original Terms (from Firestore, as on main), a cookie banner (analytics only after Accept) and self-serve account deletion in Profile (Andrew's spec v1.18, Basic §7–§8). The invented Privacy Policy, Terms rewrite and made-up legal lines were removed on 15 Oct 2026.</w:t>
             </w:r>
           </w:p>
         </w:tc>
@@ -2239,7 +2239,7 @@
           <w:p>
             <w:pPr/>
             <w:r>
-              <w:t xml:space="preserve">Company legal name, country and contact email (still placeholders on Terms and Privacy); a lawyer review before main.</w:t>
+              <w:t xml:space="preserve">Andrew's team to supply: Privacy Policy text, company details, and any refund, referral, age or disclaimer wording (to-dos proposed).</w:t>
             </w:r>
           </w:p>
         </w:tc>
@@ -7986,6 +7986,22 @@
       </w:pPr>
       <w:r>
         <w:t xml:space="preserve">Refreshed against Andrew’s spec v1.17 (Terms of Service rewrite). No rows from Rachelle’s spec changed — her spec doesn’t cover legal pages; the legal decisions row now only asks for company details and a lawyer review.</w:t>
+      </w:r>
+    </w:p>
+    <w:p>
+      <w:pPr>
+        <w:pStyle w:val="Heading2"/>
+      </w:pPr>
+      <w:r>
+        <w:t xml:space="preserve">v1.8 — 15 Oct 2026</w:t>
+      </w:r>
+    </w:p>
+    <w:p>
+      <w:pPr>
+        <w:pStyle w:val="ListBullet"/>
+      </w:pPr>
+      <w:r>
+        <w:t xml:space="preserve">Refreshed against Andrew’s spec v1.18 (invented legal text removed). No rows from Rachelle’s spec changed; the legal row now lists what Andrew’s team needs to supply.</w:t>
       </w:r>
     </w:p>
   </w:body>

</xml_diff>

<commit_message>
docs(spec): v1.19 — Console regime scoring per Plus §1.1; gap report v1.9
Co-Authored-By: Claude Opus 5.5 <noreply@anthropic.com>
Claude-Session: https://claude.ai/code/session_01YMotbPkXFZfTpX4mk3AL9V
</commit_message>
<xml_diff>
--- a/docs/Rachelle Product Specs/Kumami_Gap_Report.docx
+++ b/docs/Rachelle Product Specs/Kumami_Gap_Report.docx
@@ -25,10 +25,10 @@
         <w:rPr>
           <w:b/>
         </w:rPr>
-        <w:t xml:space="preserve">Report v1.8</w:t>
+        <w:t xml:space="preserve">Report v1.9</w:t>
       </w:r>
       <w:r>
-        <w:t xml:space="preserve"> · 15 Oct 2026 · compares Rachelle's “Kumami Website (6).docx” against the dev branch at commit dev (legal undo) (as-built spec v1.18).</w:t>
+        <w:t xml:space="preserve"> · 17 Oct 2026 · compares Rachelle's “Kumami Website (6).docx” against the dev branch at commit dev (Console regime scoring) (as-built spec v1.19).</w:t>
       </w:r>
     </w:p>
     <w:p>
@@ -140,7 +140,7 @@
     <w:p>
       <w:pPr/>
       <w:r>
-        <w:t xml:space="preserve">Plus is in good shape: every tool Rachelle listed exists and runs on live data, and the six “Tier 1 — fix immediately” bugs from her spec are all fixed. The gaps are mostly small rule details (a few thresholds and scoring weights differ from her numbers), three missing extras on Flow Radar, the AI-written sentences (no AI layer is connected yet), and two places where we followed her later mockup instead of the written spec (Spot Pulse and Intelligence no longer have their own tabs).</w:t>
+        <w:t xml:space="preserve">Plus is in good shape: every tool Rachelle listed exists and runs on live data, and the six “Tier 1 — fix immediately” bugs from her spec are all fixed. The Console’s regime scoring now follows her rules exactly (17 Oct). The remaining gaps are mostly small rule details (a few thresholds differ from her numbers, and the funding rate is read 100× too high on On-Chain and Watchlist), three missing extras on Flow Radar, the AI-written sentences (no AI layer is connected yet), and two places where we followed her later mockup instead of the written spec (Spot Pulse and Intelligence no longer have their own tabs).</w:t>
       </w:r>
     </w:p>
     <w:p>
@@ -164,7 +164,7 @@
         <w:t xml:space="preserve">Across all tools: </w:t>
       </w:r>
       <w:r>
-        <w:t xml:space="preserve">✅ Done 22  ·  🟡 Partly 28  ·  ❌ Missing 22  ·  🔒 Blocked by data plan 5  ·  ❓ Decision needed 6</w:t>
+        <w:t xml:space="preserve">✅ Done 28  ·  🟡 Partly 24  ·  ❌ Missing 22  ·  🔒 Blocked by data plan 5  ·  ❓ Decision needed 6</w:t>
       </w:r>
     </w:p>
     <w:tbl>
@@ -314,7 +314,7 @@
           <w:p>
             <w:pPr/>
             <w:r>
-              <w:t xml:space="preserve">3</w:t>
+              <w:t xml:space="preserve">9</w:t>
             </w:r>
           </w:p>
         </w:tc>
@@ -325,7 +325,7 @@
           <w:p>
             <w:pPr/>
             <w:r>
-              <w:t xml:space="preserve">5</w:t>
+              <w:t xml:space="preserve">1</w:t>
             </w:r>
           </w:p>
         </w:tc>
@@ -336,7 +336,7 @@
           <w:p>
             <w:pPr/>
             <w:r>
-              <w:t xml:space="preserve">3</w:t>
+              <w:t xml:space="preserve">1</w:t>
             </w:r>
           </w:p>
         </w:tc>
@@ -426,7 +426,7 @@
           <w:p>
             <w:pPr/>
             <w:r>
-              <w:t xml:space="preserve">1</w:t>
+              <w:t xml:space="preserve">2</w:t>
             </w:r>
           </w:p>
         </w:tc>
@@ -876,7 +876,7 @@
           <w:p>
             <w:pPr/>
             <w:r>
-              <w:t xml:space="preserve"/>
+              <w:t xml:space="preserve">1</w:t>
             </w:r>
           </w:p>
         </w:tc>
@@ -1575,28 +1575,7 @@
         <w:rPr>
           <w:b/>
         </w:rPr>
-        <w:t xml:space="preserve">2. Fix the Console regime scoring to match the spec </w:t>
-      </w:r>
-      <w:r>
-        <w:rPr>
-          <w:i/>
-        </w:rPr>
-        <w:t xml:space="preserve">(Small (≤ 1 day))</w:t>
-      </w:r>
-    </w:p>
-    <w:p>
-      <w:pPr/>
-      <w:r>
-        <w:t xml:space="preserve">Five small rule differences (extreme Fear &amp; Greed weighted ±1.5, the ±$100M ETF band, the funding neutral zone, the OI-vs-price matrix, confidence measured on active signals only, and HYPE's 0.7 confidence cap). The Console verdict is the first thing every Plus user reads, and right now it can disagree with what Rachelle's rules would say.</w:t>
-      </w:r>
-    </w:p>
-    <w:p>
-      <w:pPr/>
-      <w:r>
-        <w:rPr>
-          <w:b/>
-        </w:rPr>
-        <w:t xml:space="preserve">3. Flow Radar: correct liquidation direction and smart-money severity </w:t>
+        <w:t xml:space="preserve">2. Flow Radar: correct liquidation direction and smart-money severity </w:t>
       </w:r>
       <w:r>
         <w:rPr>
@@ -1617,7 +1596,7 @@
         <w:rPr>
           <w:b/>
         </w:rPr>
-        <w:t xml:space="preserve">4. Add the On-Chain asset HYPE (replace AVAX) and the missing OI / funding bands </w:t>
+        <w:t xml:space="preserve">3. On-Chain and Watchlist: fix the funding rate (shown 100× too high), add HYPE (replace AVAX) and the missing OI / funding bands </w:t>
       </w:r>
       <w:r>
         <w:rPr>
@@ -1629,7 +1608,7 @@
     <w:p>
       <w:pPr/>
       <w:r>
-        <w:t xml:space="preserve">On-Chain Insights is the only Plus page whose asset switcher doesn't match the BTC/ETH/SOL/BNB/HYPE universe used everywhere else.</w:t>
+        <w:t xml:space="preserve">The funding feed is read 100× too high on both pages, so normal funding shows as Overheated. On-Chain Insights is also the only Plus page whose asset switcher doesn’t match the BTC/ETH/SOL/BNB/HYPE universe used everywhere else.</w:t>
       </w:r>
     </w:p>
     <w:p>
@@ -1638,7 +1617,7 @@
         <w:rPr>
           <w:b/>
         </w:rPr>
-        <w:t xml:space="preserve">5. Decide the open questions (see “Decisions needed”) </w:t>
+        <w:t xml:space="preserve">4. Decide the open questions (see “Decisions needed”) </w:t>
       </w:r>
       <w:r>
         <w:rPr>
@@ -1659,7 +1638,7 @@
         <w:rPr>
           <w:b/>
         </w:rPr>
-        <w:t xml:space="preserve">6. Build the Exchange Flow event type and turn on cross-signal outlines for Plus </w:t>
+        <w:t xml:space="preserve">5. Build the Exchange Flow event type and turn on cross-signal outlines for Plus </w:t>
       </w:r>
       <w:r>
         <w:rPr>
@@ -1680,7 +1659,7 @@
         <w:rPr>
           <w:b/>
         </w:rPr>
-        <w:t xml:space="preserve">7. Connect an AI layer for the written interpretations </w:t>
+        <w:t xml:space="preserve">6. Connect an AI layer for the written interpretations </w:t>
       </w:r>
       <w:r>
         <w:rPr>
@@ -1701,7 +1680,7 @@
         <w:rPr>
           <w:b/>
         </w:rPr>
-        <w:t xml:space="preserve">8. Flow Radar Pro significance engine </w:t>
+        <w:t xml:space="preserve">7. Flow Radar Pro significance engine </w:t>
       </w:r>
       <w:r>
         <w:rPr>
@@ -1722,7 +1701,7 @@
         <w:rPr>
           <w:b/>
         </w:rPr>
-        <w:t xml:space="preserve">9. Watchlist Pro: add-time validation, ◆ early-signal tags, saved lists </w:t>
+        <w:t xml:space="preserve">8. Watchlist Pro: add-time validation, ◆ early-signal tags, saved lists </w:t>
       </w:r>
       <w:r>
         <w:rPr>
@@ -1743,7 +1722,7 @@
         <w:rPr>
           <w:b/>
         </w:rPr>
-        <w:t xml:space="preserve">10. Crypto Address Tracker: PnL, win rate, Trader/Farmer tags, multi-chain </w:t>
+        <w:t xml:space="preserve">9. Crypto Address Tracker: PnL, win rate, Trader/Farmer tags, multi-chain </w:t>
       </w:r>
       <w:r>
         <w:rPr>
@@ -2284,7 +2263,7 @@
         <w:rPr>
           <w:i/>
         </w:rPr>
-        <w:t xml:space="preserve">Layout, tiles and the six Tier-1 bug fixes match. The regime engine's scoring details differ from §1.1, and the AI sentence is missing.</w:t>
+        <w:t xml:space="preserve">Layout, tiles, the six Tier-1 bug fixes and the regime engine’s §1.1 scoring rules all match (since 17 Oct). The AI sentence is still missing.</w:t>
       </w:r>
     </w:p>
     <w:tbl>
@@ -2414,7 +2393,7 @@
           <w:p>
             <w:pPr/>
             <w:r>
-              <w:t xml:space="preserve">Every band scores ±1 — extremes aren't weighted more.</w:t>
+              <w:t xml:space="preserve">Built as specified: Extreme Fear +1.5, Fear +1, Neutral 0, Greed −1, Extreme Greed −1.5.</w:t>
             </w:r>
           </w:p>
         </w:tc>
@@ -2427,9 +2406,9 @@
             <w:r>
               <w:rPr>
                 <w:b/>
-                <w:color w:val="B26A00"/>
+                <w:color w:val="2E7D32"/>
               </w:rPr>
-              <w:t xml:space="preserve">🟡 Partly</w:t>
+              <w:t xml:space="preserve">✅ Done</w:t>
             </w:r>
           </w:p>
         </w:tc>
@@ -2440,7 +2419,7 @@
           <w:p>
             <w:pPr/>
             <w:r>
-              <w:t xml:space="preserve">S</w:t>
+              <w:t xml:space="preserve">—</w:t>
             </w:r>
           </w:p>
         </w:tc>
@@ -2464,7 +2443,7 @@
           <w:p>
             <w:pPr/>
             <w:r>
-              <w:t xml:space="preserve">Any positive or negative 7-day flow counts.</w:t>
+              <w:t xml:space="preserve">Built as specified: a 7-day flow inside ±$100M scores 0.</w:t>
             </w:r>
           </w:p>
         </w:tc>
@@ -2477,9 +2456,9 @@
             <w:r>
               <w:rPr>
                 <w:b/>
-                <w:color w:val="B26A00"/>
+                <w:color w:val="2E7D32"/>
               </w:rPr>
-              <w:t xml:space="preserve">🟡 Partly</w:t>
+              <w:t xml:space="preserve">✅ Done</w:t>
             </w:r>
           </w:p>
         </w:tc>
@@ -2490,7 +2469,7 @@
           <w:p>
             <w:pPr/>
             <w:r>
-              <w:t xml:space="preserve">S</w:t>
+              <w:t xml:space="preserve">—</w:t>
             </w:r>
           </w:p>
         </w:tc>
@@ -2514,7 +2493,7 @@
           <w:p>
             <w:pPr/>
             <w:r>
-              <w:t xml:space="preserve">Any negative funding scores +1 (no −0.05% threshold).</w:t>
+              <w:t xml:space="preserve">Built as specified (+0.05% to +0.1% also scores 0, which the spec leaves open). Also fixed: the Console read the funding feed 100× too high, so normal funding (about 0.007%) looked overheated and pushed the verdict bearish.</w:t>
             </w:r>
           </w:p>
         </w:tc>
@@ -2527,9 +2506,9 @@
             <w:r>
               <w:rPr>
                 <w:b/>
-                <w:color w:val="B26A00"/>
+                <w:color w:val="2E7D32"/>
               </w:rPr>
-              <w:t xml:space="preserve">🟡 Partly</w:t>
+              <w:t xml:space="preserve">✅ Done</w:t>
             </w:r>
           </w:p>
         </w:tc>
@@ -2540,7 +2519,7 @@
           <w:p>
             <w:pPr/>
             <w:r>
-              <w:t xml:space="preserve">S</w:t>
+              <w:t xml:space="preserve">—</w:t>
             </w:r>
           </w:p>
         </w:tc>
@@ -2564,7 +2543,7 @@
           <w:p>
             <w:pPr/>
             <w:r>
-              <w:t xml:space="preserve">OI up + price flat scores −1 and OI up + price down scores 0 — the two cases are swapped.</w:t>
+              <w:t xml:space="preserve">Built as specified: OI up + price flat → 0, OI up + price down → −1.</w:t>
             </w:r>
           </w:p>
         </w:tc>
@@ -2577,9 +2556,9 @@
             <w:r>
               <w:rPr>
                 <w:b/>
-                <w:color w:val="C62828"/>
+                <w:color w:val="2E7D32"/>
               </w:rPr>
-              <w:t xml:space="preserve">❌ Missing</w:t>
+              <w:t xml:space="preserve">✅ Done</w:t>
             </w:r>
           </w:p>
         </w:tc>
@@ -2590,7 +2569,7 @@
           <w:p>
             <w:pPr/>
             <w:r>
-              <w:t xml:space="preserve">S</w:t>
+              <w:t xml:space="preserve">—</w:t>
             </w:r>
           </w:p>
         </w:tc>
@@ -2614,7 +2593,7 @@
           <w:p>
             <w:pPr/>
             <w:r>
-              <w:t xml:space="preserve">Divides by all 4 signals, so confidence reads low when some signals are neutral — pushing more readings into “Neutral · Low Signal”.</w:t>
+              <w:t xml:space="preserve">Built as specified: confidence counts only the active signals, so neutral ones no longer push readings into “Neutral · Low Signal”.</w:t>
             </w:r>
           </w:p>
         </w:tc>
@@ -2627,9 +2606,9 @@
             <w:r>
               <w:rPr>
                 <w:b/>
-                <w:color w:val="B26A00"/>
+                <w:color w:val="2E7D32"/>
               </w:rPr>
-              <w:t xml:space="preserve">🟡 Partly</w:t>
+              <w:t xml:space="preserve">✅ Done</w:t>
             </w:r>
           </w:p>
         </w:tc>
@@ -2640,7 +2619,7 @@
           <w:p>
             <w:pPr/>
             <w:r>
-              <w:t xml:space="preserve">S</w:t>
+              <w:t xml:space="preserve">—</w:t>
             </w:r>
           </w:p>
         </w:tc>
@@ -2664,7 +2643,7 @@
           <w:p>
             <w:pPr/>
             <w:r>
-              <w:t xml:space="preserve">No cap.</w:t>
+              <w:t xml:space="preserve">Built: HYPE confidence never goes above 0.7.</w:t>
             </w:r>
           </w:p>
         </w:tc>
@@ -2677,9 +2656,9 @@
             <w:r>
               <w:rPr>
                 <w:b/>
-                <w:color w:val="C62828"/>
+                <w:color w:val="2E7D32"/>
               </w:rPr>
-              <w:t xml:space="preserve">❌ Missing</w:t>
+              <w:t xml:space="preserve">✅ Done</w:t>
             </w:r>
           </w:p>
         </w:tc>
@@ -2690,7 +2669,7 @@
           <w:p>
             <w:pPr/>
             <w:r>
-              <w:t xml:space="preserve">S</w:t>
+              <w:t xml:space="preserve">—</w:t>
             </w:r>
           </w:p>
         </w:tc>
@@ -3141,6 +3120,56 @@
           <w:p>
             <w:pPr/>
             <w:r>
+              <w:t xml:space="preserve">Funding rate shown as a percentage (e.g. 0.007%).</w:t>
+            </w:r>
+          </w:p>
+        </w:tc>
+        <w:tc>
+          <w:tcPr>
+            <w:tcW w:type="dxa" w:w="3300"/>
+          </w:tcPr>
+          <w:p>
+            <w:pPr/>
+            <w:r>
+              <w:t xml:space="preserve">Shown 100× too high (BTC reads about 0.66% instead of 0.007%), so the panel usually says Overheated. Found 17 Oct; the Console had the same bug and is fixed.</w:t>
+            </w:r>
+          </w:p>
+        </w:tc>
+        <w:tc>
+          <w:tcPr>
+            <w:tcW w:type="dxa" w:w="1500"/>
+          </w:tcPr>
+          <w:p>
+            <w:pPr/>
+            <w:r>
+              <w:rPr>
+                <w:b/>
+                <w:color w:val="C62828"/>
+              </w:rPr>
+              <w:t xml:space="preserve">❌ Missing</w:t>
+            </w:r>
+          </w:p>
+        </w:tc>
+        <w:tc>
+          <w:tcPr>
+            <w:tcW w:type="dxa" w:w="900"/>
+          </w:tcPr>
+          <w:p>
+            <w:pPr/>
+            <w:r>
+              <w:t xml:space="preserve">S</w:t>
+            </w:r>
+          </w:p>
+        </w:tc>
+      </w:tr>
+      <w:tr>
+        <w:tc>
+          <w:tcPr>
+            <w:tcW w:type="dxa" w:w="3300"/>
+          </w:tcPr>
+          <w:p>
+            <w:pPr/>
+            <w:r>
               <w:t xml:space="preserve">Liquidations 24H: Mass Long Flush = red, Short Squeeze = green, “Cascade —” over $500M.</w:t>
             </w:r>
           </w:p>
@@ -4981,6 +5010,56 @@
                 <w:color w:val="B26A00"/>
               </w:rPr>
               <w:t xml:space="preserve">🟡 Partly</w:t>
+            </w:r>
+          </w:p>
+        </w:tc>
+        <w:tc>
+          <w:tcPr>
+            <w:tcW w:type="dxa" w:w="900"/>
+          </w:tcPr>
+          <w:p>
+            <w:pPr/>
+            <w:r>
+              <w:t xml:space="preserve">S</w:t>
+            </w:r>
+          </w:p>
+        </w:tc>
+      </w:tr>
+      <w:tr>
+        <w:tc>
+          <w:tcPr>
+            <w:tcW w:type="dxa" w:w="3300"/>
+          </w:tcPr>
+          <w:p>
+            <w:pPr/>
+            <w:r>
+              <w:t xml:space="preserve">“Overheated” tag only when funding is above +0.1%.</w:t>
+            </w:r>
+          </w:p>
+        </w:tc>
+        <w:tc>
+          <w:tcPr>
+            <w:tcW w:type="dxa" w:w="3300"/>
+          </w:tcPr>
+          <w:p>
+            <w:pPr/>
+            <w:r>
+              <w:t xml:space="preserve">The funding feed is read 100× too high, so almost every coin is tagged Overheated. Found 17 Oct.</w:t>
+            </w:r>
+          </w:p>
+        </w:tc>
+        <w:tc>
+          <w:tcPr>
+            <w:tcW w:type="dxa" w:w="1500"/>
+          </w:tcPr>
+          <w:p>
+            <w:pPr/>
+            <w:r>
+              <w:rPr>
+                <w:b/>
+                <w:color w:val="C62828"/>
+              </w:rPr>
+              <w:t xml:space="preserve">❌ Missing</w:t>
             </w:r>
           </w:p>
         </w:tc>
@@ -8002,6 +8081,38 @@
       </w:pPr>
       <w:r>
         <w:t xml:space="preserve">Refreshed against Andrew’s spec v1.18 (invented legal text removed). No rows from Rachelle’s spec changed; the legal row now lists what Andrew’s team needs to supply.</w:t>
+      </w:r>
+    </w:p>
+    <w:p>
+      <w:pPr>
+        <w:pStyle w:val="Heading2"/>
+      </w:pPr>
+      <w:r>
+        <w:t xml:space="preserve">v1.9 — 17 Oct 2026</w:t>
+      </w:r>
+    </w:p>
+    <w:p>
+      <w:pPr>
+        <w:pStyle w:val="ListBullet"/>
+      </w:pPr>
+      <w:r>
+        <w:t xml:space="preserve">Closed: Console regime scoring now follows Plus §1.1 — weighted Fear &amp; Greed extremes (±1.5), the ±$100M ETF band, the funding neutral zone, the OI-vs-price matrix, confidence on active signals only, and HYPE’s 0.7 confidence cap.</w:t>
+      </w:r>
+    </w:p>
+    <w:p>
+      <w:pPr>
+        <w:pStyle w:val="ListBullet"/>
+      </w:pPr>
+      <w:r>
+        <w:t xml:space="preserve">New gap: the funding rate is read 100× too high on On-Chain Insights and Watchlist (normal funding shows as Overheated). Fixed on the Console in the same change.</w:t>
+      </w:r>
+    </w:p>
+    <w:p>
+      <w:pPr>
+        <w:pStyle w:val="ListBullet"/>
+      </w:pPr>
+      <w:r>
+        <w:t xml:space="preserve">Not re-compared: the other tools (no code changes there since v1.8).</w:t>
       </w:r>
     </w:p>
   </w:body>

</xml_diff>